<commit_message>
Site v4: full redesign (network-field canvas, cycling role typewriter, marquee, project filters, orbit-ring profile) + resume v4 with all 14 projects + regenerated DOCX (12 repos)
</commit_message>
<xml_diff>
--- a/John-Mark-Alojado-Resume.docx
+++ b/John-Mark-Alojado-Resume.docx
@@ -39,16 +39,16 @@
         <w:pStyle w:val="RBody"/>
       </w:pPr>
       <w:r>
-        <w:t xml:space="preserve">BSIT student with two years of hands-on IT and security work: Linux administration, Docker, log analysis, and security auditing. Author of </w:t>
+        <w:t xml:space="preserve">BSIT student with 2+ years of hands-on IT and security operations experience: hardware and OS diagnostics, Linux administration (Fedora, CachyOS), Docker, and security auditing. Author of </w:t>
       </w:r>
       <w:r>
         <w:rPr>
           <w:b/>
         </w:rPr>
-        <w:t>ten open-source security tools</w:t>
+        <w:t>twelve open-source repositories</w:t>
       </w:r>
       <w:r>
-        <w:t xml:space="preserve"> on GitHub — port scanners, phishing detectors, log analyzers, and a scope-locked recon framework — each with a real test suite and zero external dependencies. Built for security operations: the log analysis, hardening audits, and detection engineering I run at home is the same work a SOC does at scale.</w:t>
+        <w:t xml:space="preserve"> — an attack-surface framework with rules-of-engagement enforcement, a honeypot-driven SIEM with a 3D attack map, Naive Bayes classifiers written from first principles, and log-analysis and hardening tools — every one shipped with a test suite and zero external dependencies. The security operations I run at home is the same work a SOC does at scale. Best Innovation Award and 1st Place Division winner.</w:t>
       </w:r>
     </w:p>
     <w:p>
@@ -70,7 +70,21 @@
         <w:t xml:space="preserve">Security operations: </w:t>
       </w:r>
       <w:r>
-        <w:t>log analysis, incident triage, threat detection, vulnerability management, security auditing, phishing detection, malware analysis</w:t>
+        <w:t>log analysis, incident triage, threat detection, vulnerability management, CIS hardening, malware analysis, phishing detection, honeypots</w:t>
+      </w:r>
+    </w:p>
+    <w:p>
+      <w:pPr>
+        <w:pStyle w:val="RBody"/>
+      </w:pPr>
+      <w:r>
+        <w:rPr>
+          <w:b/>
+        </w:rPr>
+        <w:t xml:space="preserve">Offensive / recon: </w:t>
+      </w:r>
+      <w:r>
+        <w:t>network recon, subdomain enumeration, port scanning, CORS testing, secret detection, scope enforcement, engagement reporting</w:t>
       </w:r>
     </w:p>
     <w:p>
@@ -84,7 +98,7 @@
         <w:t xml:space="preserve">Systems: </w:t>
       </w:r>
       <w:r>
-        <w:t>Linux (Fedora, CachyOS), Bash, Docker, systemd/journald, NetworkManager/nmcli, dual-boot provisioning, TCP/IP networking</w:t>
+        <w:t>Linux (Fedora, CachyOS), Bash, Docker, systemd/journald, NetworkManager/nmcli, dual-boot provisioning, TCP/IP</w:t>
       </w:r>
     </w:p>
     <w:p>
@@ -98,7 +112,7 @@
         <w:t xml:space="preserve">Development: </w:t>
       </w:r>
       <w:r>
-        <w:t>Python (asyncio, stdlib-only engineering), C/C++, HTML/CSS/JS, SQL, REST APIs, Git/GitHub, Telegram Bot API</w:t>
+        <w:t>Python (asyncio, stdlib engineering), from-scratch machine learning (Naive Bayes), C/C++, HTML/CSS/JS, SQL/SQLite, REST APIs, Git, Telegram Bot API</w:t>
       </w:r>
     </w:p>
     <w:p>
@@ -112,7 +126,7 @@
         <w:t xml:space="preserve">IT support: </w:t>
       </w:r>
       <w:r>
-        <w:t>hardware diagnostics, OS install and repair, network troubleshooting, technical documentation, customer service (English professional, Filipino native)</w:t>
+        <w:t>hardware diagnostics, OS install and repair, network troubleshooting, technical documentation, user training (English professional, Filipino native)</w:t>
       </w:r>
     </w:p>
     <w:p>
@@ -128,7 +142,7 @@
         <w:pStyle w:val="RTitle"/>
       </w:pPr>
       <w:r>
-        <w:t>sibat — scope-locked recon framework</w:t>
+        <w:t>sibat — scope-locked attack-surface framework</w:t>
       </w:r>
     </w:p>
     <w:p>
@@ -136,7 +150,7 @@
         <w:pStyle w:val="ListBullet"/>
       </w:pPr>
       <w:r>
-        <w:t>Scope Guard enforces rules of engagement in code: every stage passes targets through a scope check and refuses anything out of scope before a packet is sent.</w:t>
+        <w:t>Scope Guard enforces rules of engagement in code: every stage passes targets through a scope check; anything out of scope is refused before a packet is sent.</w:t>
       </w:r>
     </w:p>
     <w:p>
@@ -144,7 +158,7 @@
         <w:pStyle w:val="ListBullet"/>
       </w:pPr>
       <w:r>
-        <w:t>Pipeline: passive subdomain enumeration via certificate transparency (crt.sh, certspotter), TCP port scanning, banner grabbing, CORS misconfiguration probing, JavaScript secret and endpoint extraction, 95-path content discovery.</w:t>
+        <w:t>Passive subdomain enumeration via certificate transparency (crt.sh, certspotter), TCP scanning with a policy-compliant rate limiter, CORS misconfiguration probing, JavaScript secret and endpoint extraction, 95-path content discovery.</w:t>
       </w:r>
     </w:p>
     <w:p>
@@ -152,7 +166,79 @@
         <w:pStyle w:val="ListBullet"/>
       </w:pPr>
       <w:r>
-        <w:t>Verified against its own built-in vulnerable lab (31 findings in about one second) and a real home-network router audit; SQLite history and HTML reports.</w:t>
+        <w:t>Three exploit-verification modules (path traversal, command injection, open redirect) confirmed live against a built-in vulnerable lab; operator dashboard whose fire API is also scope-guarded.</w:t>
+      </w:r>
+    </w:p>
+    <w:p>
+      <w:pPr>
+        <w:pStyle w:val="ListBullet"/>
+      </w:pPr>
+      <w:r>
+        <w:t>Post-exploitation enumeration and payload-obfuscation research; verified in a real home-network router audit.</w:t>
+      </w:r>
+    </w:p>
+    <w:p>
+      <w:pPr>
+        <w:pStyle w:val="RTitle"/>
+      </w:pPr>
+      <w:r>
+        <w:t>tanggol — honeypot-driven SIEM with 3D attack map</w:t>
+      </w:r>
+    </w:p>
+    <w:p>
+      <w:pPr>
+        <w:pStyle w:val="ListBullet"/>
+      </w:pPr>
+      <w:r>
+        <w:t>Honeypot traps (SSH, HTTP tarpit, port-sweep decoys) feed a thread-safe SQLite event store.</w:t>
+      </w:r>
+    </w:p>
+    <w:p>
+      <w:pPr>
+        <w:pStyle w:val="ListBullet"/>
+      </w:pPr>
+      <w:r>
+        <w:t>Brute-force and portscan detectors with verified thresholds; alerts persist across restarts.</w:t>
+      </w:r>
+    </w:p>
+    <w:p>
+      <w:pPr>
+        <w:pStyle w:val="ListBullet"/>
+      </w:pPr>
+      <w:r>
+        <w:t>Terminal-styled SIEM dashboard plus a Three.js 3D attack globe with animated attack arcs; POST feed API accepts events from other machines.</w:t>
+      </w:r>
+    </w:p>
+    <w:p>
+      <w:pPr>
+        <w:pStyle w:val="RTitle"/>
+      </w:pPr>
+      <w:r>
+        <w:t>ml-detector — Naive Bayes classifier written from first principles</w:t>
+      </w:r>
+    </w:p>
+    <w:p>
+      <w:pPr>
+        <w:pStyle w:val="ListBullet"/>
+      </w:pPr>
+      <w:r>
+        <w:t>Every ML layer hand-implemented: tokenizer, Bag-of-Words vectorization, Multinomial Naive Bayes with Laplace smoothing, log-space classification, softmax confidence, from-scratch evaluation (accuracy, precision, recall, F1).</w:t>
+      </w:r>
+    </w:p>
+    <w:p>
+      <w:pPr>
+        <w:pStyle w:val="ListBullet"/>
+      </w:pPr>
+      <w:r>
+        <w:t>Trains in 0.4 seconds with zero ML libraries (no numpy, sklearn, or torch); models serialize to JSON.</w:t>
+      </w:r>
+    </w:p>
+    <w:p>
+      <w:pPr>
+        <w:pStyle w:val="ListBullet"/>
+      </w:pPr>
+      <w:r>
+        <w:t>Classifies unseen scam messages at 100% and lookalike phishing URLs at 89-100% confidence; 8-test suite covers the math and serialization round-trips.</w:t>
       </w:r>
     </w:p>
     <w:p>
@@ -168,7 +254,7 @@
         <w:pStyle w:val="ListBullet"/>
       </w:pPr>
       <w:r>
-        <w:t>Personal agent commanded over Telegram in Taglish with a bring-your-own-key AI brain (Groq, Gemini fallback) and persistent memory across sessions.</w:t>
+        <w:t>Agent commanded over Telegram in Taglish with a bring-your-own-key AI brain (Groq, Gemini fallback) and persistent memory across sessions.</w:t>
       </w:r>
     </w:p>
     <w:p>
@@ -176,7 +262,7 @@
         <w:pStyle w:val="ListBullet"/>
       </w:pPr>
       <w:r>
-        <w:t>Plugin skill system: study-note generation from links, scam-pattern vetting for marketplace listings, deal-criteria storage. Owner-locked to one account; pure standard library.</w:t>
+        <w:t>Plugin skill system: study-note generation, scam-pattern vetting, deal-criteria storage; owner-locked to one account; pure standard library.</w:t>
       </w:r>
     </w:p>
     <w:p>
@@ -184,7 +270,7 @@
         <w:pStyle w:val="RTitle"/>
       </w:pPr>
       <w:r>
-        <w:t>logsentinel — SSH and auth log intrusion analyzer</w:t>
+        <w:t>bantay — family scam defense center</w:t>
       </w:r>
     </w:p>
     <w:p>
@@ -192,7 +278,7 @@
         <w:pStyle w:val="ListBullet"/>
       </w:pPr>
       <w:r>
-        <w:t>Detects brute-force bursts, password-spray campaigns, and successful logins after failures (likely-compromise indicator).</w:t>
+        <w:t>Classifies forwarded SMS/chat as SCAM / SUSPICIOUS / safe with a plain-Taglish verdict and the exact action to take; 18 weighted rules; instant-scam override for OTP theft.</w:t>
       </w:r>
     </w:p>
     <w:p>
@@ -200,7 +286,7 @@
         <w:pStyle w:val="ListBullet"/>
       </w:pPr>
       <w:r>
-        <w:t>Severity-ranked alerts, top attacker and target tables, CSV IOC extraction; 16 tests on realistic fixture logs.</w:t>
+        <w:t>Breach-database monitor and a PH scam-wave radar; 9-test suite validates verdict paths.</w:t>
       </w:r>
     </w:p>
     <w:p>
@@ -208,7 +294,7 @@
         <w:pStyle w:val="RTitle"/>
       </w:pPr>
       <w:r>
-        <w:t>netrecon — asynchronous TCP port scanner</w:t>
+        <w:t>hacker-arcade — security mini-games (live on GitHub Pages)</w:t>
       </w:r>
     </w:p>
     <w:p>
@@ -216,7 +302,7 @@
         <w:pStyle w:val="ListBullet"/>
       </w:pPr>
       <w:r>
-        <w:t>500 concurrent connections, banner grabbing, 60+ service fingerprints, JSON/CSV export.</w:t>
+        <w:t>Four games with a full CRT aesthetic: Password Crack (hash cracking with leetspeak transforms), Trace the Route (traceroute reasoning), Phish Spot (real lookalike-domain patterns), Port Roulette (service-port reflexes).</w:t>
       </w:r>
     </w:p>
     <w:p>
@@ -224,7 +310,7 @@
         <w:pStyle w:val="ListBullet"/>
       </w:pPr>
       <w:r>
-        <w:t>17-test integration suite that spins up live TCP servers — no mocks.</w:t>
+        <w:t>Vanilla HTML/CSS/JS; lives, timers, level scaling, and scoring throughout.</w:t>
       </w:r>
     </w:p>
     <w:p>
@@ -232,7 +318,7 @@
         <w:pStyle w:val="RTitle"/>
       </w:pPr>
       <w:r>
-        <w:t>phishguard — offline phishing URL detector</w:t>
+        <w:t>logsentinel, netrecon, sysarmor, hashbreak, phishguard, certwatch, redact — security tool suite</w:t>
       </w:r>
     </w:p>
     <w:p>
@@ -240,7 +326,7 @@
         <w:pStyle w:val="ListBullet"/>
       </w:pPr>
       <w:r>
-        <w:t>30+ lexical heuristics: brand-spoof subdomains, punycode homoglyphs, credential-bait paths; scores URLs 0-100 with zero network calls.</w:t>
+        <w:t>logsentinel: SSH/auth log intrusion analysis (brute force, password spray, post-failure success), 16 tests.</w:t>
       </w:r>
     </w:p>
     <w:p>
@@ -248,7 +334,47 @@
         <w:pStyle w:val="ListBullet"/>
       </w:pPr>
       <w:r>
-        <w:t>21 tests validating known-bad patterns fire and benign URLs stay quiet.</w:t>
+        <w:t>netrecon: async TCP port scanner, 500 concurrent connections, 60+ fingerprints, 17 live-server tests.</w:t>
+      </w:r>
+    </w:p>
+    <w:p>
+      <w:pPr>
+        <w:pStyle w:val="ListBullet"/>
+      </w:pPr>
+      <w:r>
+        <w:t>sysarmor: CIS-style Linux hardening audits scoring a host 0-100, verified on live Fedora, 16 tests.</w:t>
+      </w:r>
+    </w:p>
+    <w:p>
+      <w:pPr>
+        <w:pStyle w:val="ListBullet"/>
+      </w:pPr>
+      <w:r>
+        <w:t>hashbreak: 18+ hash format identification and dictionary cracking, 27 tests.</w:t>
+      </w:r>
+    </w:p>
+    <w:p>
+      <w:pPr>
+        <w:pStyle w:val="ListBullet"/>
+      </w:pPr>
+      <w:r>
+        <w:t>phishguard: offline phishing URL detector with 30+ lexical heuristics, 21 tests.</w:t>
+      </w:r>
+    </w:p>
+    <w:p>
+      <w:pPr>
+        <w:pStyle w:val="ListBullet"/>
+      </w:pPr>
+      <w:r>
+        <w:t>certwatch: TLS certificate watchdog parsing raw DER with the standard library only.</w:t>
+      </w:r>
+    </w:p>
+    <w:p>
+      <w:pPr>
+        <w:pStyle w:val="ListBullet"/>
+      </w:pPr>
+      <w:r>
+        <w:t>redact: secret scanner and CI gate with 20+ credential rules and entropy filtering, 17 tests.</w:t>
       </w:r>
     </w:p>
     <w:p>
@@ -256,7 +382,7 @@
         <w:pStyle w:val="RTitle"/>
       </w:pPr>
       <w:r>
-        <w:t>hashbreak — hash identification and password auditing</w:t>
+        <w:t>ulatbayan — barangay reporting system (civic tech)</w:t>
       </w:r>
     </w:p>
     <w:p>
@@ -264,15 +390,7 @@
         <w:pStyle w:val="ListBullet"/>
       </w:pPr>
       <w:r>
-        <w:t>Identifies 18+ hash formats; rule-augmented dictionary cracking (leetspeak, mutation rules, salt positions); entropy-based strength auditing; 27 tests.</w:t>
-      </w:r>
-    </w:p>
-    <w:p>
-      <w:pPr>
-        <w:pStyle w:val="RTitle"/>
-      </w:pPr>
-      <w:r>
-        <w:t>certwatch — TLS certificate watchdog</w:t>
+        <w:t>Full-stack complaint and reporting system in one file with zero dependencies, built for offline community use.</w:t>
       </w:r>
     </w:p>
     <w:p>
@@ -280,63 +398,7 @@
         <w:pStyle w:val="ListBullet"/>
       </w:pPr>
       <w:r>
-        <w:t>Expiry countdown, self-signed detection via system-CA validation, weak-key flags, wildcard-aware SAN matching; parses raw DER with the standard library only; live-tested against real TLS endpoints.</w:t>
-      </w:r>
-    </w:p>
-    <w:p>
-      <w:pPr>
-        <w:pStyle w:val="RTitle"/>
-      </w:pPr>
-      <w:r>
-        <w:t>redact — secret scanner and CI gate</w:t>
-      </w:r>
-    </w:p>
-    <w:p>
-      <w:pPr>
-        <w:pStyle w:val="ListBullet"/>
-      </w:pPr>
-      <w:r>
-        <w:t>20+ credential rules (AWS keys, GitHub tokens, PEM blocks, DB URIs) with entropy filtering; in-place auto-redaction; exit-code CI gate; 17 tests including false-positive guards.</w:t>
-      </w:r>
-    </w:p>
-    <w:p>
-      <w:pPr>
-        <w:pStyle w:val="RTitle"/>
-      </w:pPr>
-      <w:r>
-        <w:t>sysarmor — Linux hardening auditor</w:t>
-      </w:r>
-    </w:p>
-    <w:p>
-      <w:pPr>
-        <w:pStyle w:val="ListBullet"/>
-      </w:pPr>
-      <w:r>
-        <w:t>CIS-style checks on SSH config, file permissions, sysctl parameters, account hygiene, and pending updates; scores a host 0-100 with per-check remediation; verified on a live Fedora system; 16 tests.</w:t>
-      </w:r>
-    </w:p>
-    <w:p>
-      <w:pPr>
-        <w:pStyle w:val="RTitle"/>
-      </w:pPr>
-      <w:r>
-        <w:t>UlatBayan — barangay reporting system (civic tech)</w:t>
-      </w:r>
-    </w:p>
-    <w:p>
-      <w:pPr>
-        <w:pStyle w:val="ListBullet"/>
-      </w:pPr>
-      <w:r>
-        <w:t>Full-stack complaint and reporting system in one file with zero dependencies, built for offline community use; public transparency board with aggregate stats.</w:t>
-      </w:r>
-    </w:p>
-    <w:p>
-      <w:pPr>
-        <w:pStyle w:val="ListBullet"/>
-      </w:pPr>
-      <w:r>
-        <w:t>Security engineering: PBKDF2-HMAC-SHA256 auth, CSRF tokens, HttpOnly/SameSite sessions, login rate limiting, XSS-escaped templates; 18 end-to-end tests against a live server.</w:t>
+        <w:t>PBKDF2-HMAC-SHA256 auth, CSRF tokens, HttpOnly/SameSite sessions, rate limiting, XSS-escaped templates; 18 end-to-end tests against a live server.</w:t>
       </w:r>
     </w:p>
     <w:p>
@@ -368,7 +430,7 @@
         <w:pStyle w:val="ListBullet"/>
       </w:pPr>
       <w:r>
-        <w:t>Diagnosed, repaired, and reconfigured hardware, operating systems, and network settings across multiple systems; structured root-cause analysis for Tier-1 resolution of OS glitches, driver conflicts, and network breakage.</w:t>
+        <w:t>Diagnosed, repaired, and reconfigured hardware, operating systems, and network settings across multiple systems; structured root-cause analysis for Tier-1 resolution.</w:t>
       </w:r>
     </w:p>
     <w:p>
@@ -376,7 +438,7 @@
         <w:pStyle w:val="ListBullet"/>
       </w:pPr>
       <w:r>
-        <w:t>Audited system logs and desktop environments for suspicious processes, malware, and persistence mechanisms.</w:t>
+        <w:t>Audited system logs and desktop environments for suspicious processes, malware, and persistence mechanisms; ran CIS-baseline hardening audits on live Linux hosts.</w:t>
       </w:r>
     </w:p>
     <w:p>
@@ -392,7 +454,7 @@
         <w:pStyle w:val="ListBullet"/>
       </w:pPr>
       <w:r>
-        <w:t>Provisioned dual-boot Windows/Linux (Fedora, CachyOS) environments and Docker-based infrastructure for local services and tooling.</w:t>
+        <w:t>Provisioned dual-boot Windows/Linux (Fedora, CachyOS) environments and Docker-based infrastructure.</w:t>
       </w:r>
     </w:p>
     <w:p>
@@ -432,7 +494,7 @@
         <w:pStyle w:val="ListBullet"/>
       </w:pPr>
       <w:r>
-        <w:t>Automated inventory workflows with Google Sheets (VLOOKUP, pivot tables); trained new staff on procedures.</w:t>
+        <w:t>Automated inventory workflows with Google Sheets (VLOOKUP, pivot tables); trained new staff.</w:t>
       </w:r>
     </w:p>
     <w:p>

</xml_diff>